<commit_message>
fix: populate full properties on unique_tools and implement full_pn token across context models
</commit_message>
<xml_diff>
--- a/backend/wi_templates/ERA DOC-00011 - 55-00007 Rev.A - Nova Power Supply Sub-Assembly WI.docx
+++ b/backend/wi_templates/ERA DOC-00011 - 55-00007 Rev.A - Nova Power Supply Sub-Assembly WI.docx
@@ -370,9 +370,9 @@
         <w:tblLook w:val="04A0" w:firstRow="1" w:lastRow="0" w:firstColumn="1" w:lastColumn="0" w:noHBand="0" w:noVBand="1"/>
       </w:tblPr>
       <w:tblGrid>
-        <w:gridCol w:w="2749"/>
-        <w:gridCol w:w="3869"/>
-        <w:gridCol w:w="2012"/>
+        <w:gridCol w:w="2315"/>
+        <w:gridCol w:w="4346"/>
+        <w:gridCol w:w="1969"/>
       </w:tblGrid>
       <w:tr>
         <w:trPr>
@@ -424,10 +424,54 @@
           </w:tcPr>
           <w:p>
             <w:r>
-              <w:t>{% for tool in step.tools %}</w:t>
+              <w:t xml:space="preserve">{% for tool in </w:t>
+            </w:r>
+            <w:proofErr w:type="spellStart"/>
+            <w:r>
+              <w:t>unique_tools</w:t>
+            </w:r>
+            <w:proofErr w:type="spellEnd"/>
+            <w:r>
+              <w:t xml:space="preserve"> </w:t>
+            </w:r>
+            <w:proofErr w:type="gramStart"/>
+            <w:r>
+              <w:t>%}</w:t>
             </w:r>
             <w:r>
-              <w:t>{{step.step_number}}</w:t>
+              <w:t>{</w:t>
+            </w:r>
+            <w:proofErr w:type="gramEnd"/>
+            <w:r>
+              <w:t>{</w:t>
+            </w:r>
+            <w:r>
+              <w:t>tool</w:t>
+            </w:r>
+            <w:r>
+              <w:t>.</w:t>
+            </w:r>
+            <w:r>
+              <w:t>pn</w:t>
+            </w:r>
+            <w:r>
+              <w:t>}}</w:t>
+            </w:r>
+            <w:r>
+              <w:t xml:space="preserve"> Rev.</w:t>
+            </w:r>
+            <w:r>
+              <w:t>{{</w:t>
+            </w:r>
+            <w:proofErr w:type="spellStart"/>
+            <w:proofErr w:type="gramStart"/>
+            <w:r>
+              <w:t>tool.revision</w:t>
+            </w:r>
+            <w:proofErr w:type="spellEnd"/>
+            <w:proofErr w:type="gramEnd"/>
+            <w:r>
+              <w:t>}}</w:t>
             </w:r>
           </w:p>
         </w:tc>
@@ -441,7 +485,17 @@
               <w:cnfStyle w:val="000000100000" w:firstRow="0" w:lastRow="0" w:firstColumn="0" w:lastColumn="0" w:oddVBand="0" w:evenVBand="0" w:oddHBand="1" w:evenHBand="0" w:firstRowFirstColumn="0" w:firstRowLastColumn="0" w:lastRowFirstColumn="0" w:lastRowLastColumn="0"/>
             </w:pPr>
             <w:r>
-              <w:t>{{tool.description}}</w:t>
+              <w:t>{{</w:t>
+            </w:r>
+            <w:proofErr w:type="spellStart"/>
+            <w:proofErr w:type="gramStart"/>
+            <w:r>
+              <w:t>tool.description</w:t>
+            </w:r>
+            <w:proofErr w:type="spellEnd"/>
+            <w:proofErr w:type="gramEnd"/>
+            <w:r>
+              <w:t>}}</w:t>
             </w:r>
           </w:p>
         </w:tc>
@@ -454,7 +508,33 @@
               <w:cnfStyle w:val="000000100000" w:firstRow="0" w:lastRow="0" w:firstColumn="0" w:lastColumn="0" w:oddVBand="0" w:evenVBand="0" w:oddHBand="1" w:evenHBand="0" w:firstRowFirstColumn="0" w:firstRowLastColumn="0" w:lastRowFirstColumn="0" w:lastRowLastColumn="0"/>
             </w:pPr>
             <w:r>
-              <w:t>{{tool.image}}{% endfor %}</w:t>
+              <w:t>{{</w:t>
+            </w:r>
+            <w:proofErr w:type="spellStart"/>
+            <w:proofErr w:type="gramStart"/>
+            <w:r>
+              <w:t>tool.image</w:t>
+            </w:r>
+            <w:proofErr w:type="spellEnd"/>
+            <w:proofErr w:type="gramEnd"/>
+            <w:r>
+              <w:t> | width:3.5cm</w:t>
+            </w:r>
+            <w:proofErr w:type="gramStart"/>
+            <w:r>
+              <w:t>}}{</w:t>
+            </w:r>
+            <w:proofErr w:type="gramEnd"/>
+            <w:r>
+              <w:t xml:space="preserve">% </w:t>
+            </w:r>
+            <w:proofErr w:type="spellStart"/>
+            <w:r>
+              <w:t>endfor</w:t>
+            </w:r>
+            <w:proofErr w:type="spellEnd"/>
+            <w:r>
+              <w:t xml:space="preserve"> %}</w:t>
             </w:r>
           </w:p>
         </w:tc>
@@ -4905,7 +4985,9 @@
     <w:rsid w:val="004C5C1A"/>
     <w:rsid w:val="005901F2"/>
     <w:rsid w:val="00612982"/>
+    <w:rsid w:val="00624F1E"/>
     <w:rsid w:val="007B6D06"/>
+    <w:rsid w:val="007D0F26"/>
     <w:rsid w:val="007E2697"/>
     <w:rsid w:val="008D18D3"/>
     <w:rsid w:val="00904ED8"/>
@@ -5759,28 +5841,6 @@
 </file>
 
 <file path=customXml/item2.xml><?xml version="1.0" encoding="utf-8"?>
-<p:properties xmlns:p="http://schemas.microsoft.com/office/2006/metadata/properties" xmlns:xsi="http://www.w3.org/2001/XMLSchema-instance" xmlns:pc="http://schemas.microsoft.com/office/infopath/2007/PartnerControls">
-  <documentManagement>
-    <Revision xmlns="d0a21689-7831-42d6-ab5e-18dcb17ec99f">A</Revision>
-    <DocumentID xmlns="d0a21689-7831-42d6-ab5e-18dcb17ec99f">DOC-00011</DocumentID>
-    <Confidentiality xmlns="d0a21689-7831-42d6-ab5e-18dcb17ec99f">Internal</Confidentiality>
-    <Status xmlns="d0a21689-7831-42d6-ab5e-18dcb17ec99f">Preliminary</Status>
-    <AssignedMaintainer xmlns="d0a21689-7831-42d6-ab5e-18dcb17ec99f">
-      <UserInfo>
-        <DisplayName>Slava Thereshin</DisplayName>
-        <AccountId>11</AccountId>
-        <AccountType/>
-      </UserInfo>
-    </AssignedMaintainer>
-  </documentManagement>
-</p:properties>
-</file>
-
-<file path=customXml/item3.xml><?xml version="1.0" encoding="utf-8"?>
-<b:Sources xmlns:b="http://schemas.openxmlformats.org/officeDocument/2006/bibliography" xmlns="http://schemas.openxmlformats.org/officeDocument/2006/bibliography" SelectedStyle="\APASixthEditionOfficeOnline.xsl" StyleName="APA" Version="6"/>
-</file>
-
-<file path=customXml/item4.xml><?xml version="1.0" encoding="utf-8"?>
 <ct:contentTypeSchema xmlns:ct="http://schemas.microsoft.com/office/2006/metadata/contentType" xmlns:ma="http://schemas.microsoft.com/office/2006/metadata/properties/metaAttributes" ct:_="" ma:_="" ma:contentTypeName="Document" ma:contentTypeID="0x01010097E3F458759F934FBF98477861B30E17" ma:contentTypeVersion="9" ma:contentTypeDescription="Create a new document." ma:contentTypeScope="" ma:versionID="20bd56559113204125d9b5a00727f95e">
   <xsd:schema xmlns:xsd="http://www.w3.org/2001/XMLSchema" xmlns:xs="http://www.w3.org/2001/XMLSchema" xmlns:p="http://schemas.microsoft.com/office/2006/metadata/properties" xmlns:ns2="d0a21689-7831-42d6-ab5e-18dcb17ec99f" targetNamespace="http://schemas.microsoft.com/office/2006/metadata/properties" ma:root="true" ma:fieldsID="1a465cdb4615ac0d137ed4d3b9785716" ns2:_="">
     <xsd:import namespace="d0a21689-7831-42d6-ab5e-18dcb17ec99f"/>
@@ -5976,6 +6036,28 @@
 </ct:contentTypeSchema>
 </file>
 
+<file path=customXml/item3.xml><?xml version="1.0" encoding="utf-8"?>
+<b:Sources xmlns:b="http://schemas.openxmlformats.org/officeDocument/2006/bibliography" xmlns="http://schemas.openxmlformats.org/officeDocument/2006/bibliography" SelectedStyle="\APASixthEditionOfficeOnline.xsl" StyleName="APA" Version="6"/>
+</file>
+
+<file path=customXml/item4.xml><?xml version="1.0" encoding="utf-8"?>
+<p:properties xmlns:p="http://schemas.microsoft.com/office/2006/metadata/properties" xmlns:xsi="http://www.w3.org/2001/XMLSchema-instance" xmlns:pc="http://schemas.microsoft.com/office/infopath/2007/PartnerControls">
+  <documentManagement>
+    <Revision xmlns="d0a21689-7831-42d6-ab5e-18dcb17ec99f">A</Revision>
+    <DocumentID xmlns="d0a21689-7831-42d6-ab5e-18dcb17ec99f">DOC-00011</DocumentID>
+    <Confidentiality xmlns="d0a21689-7831-42d6-ab5e-18dcb17ec99f">Internal</Confidentiality>
+    <Status xmlns="d0a21689-7831-42d6-ab5e-18dcb17ec99f">Preliminary</Status>
+    <AssignedMaintainer xmlns="d0a21689-7831-42d6-ab5e-18dcb17ec99f">
+      <UserInfo>
+        <DisplayName>Slava Thereshin</DisplayName>
+        <AccountId>11</AccountId>
+        <AccountType/>
+      </UserInfo>
+    </AssignedMaintainer>
+  </documentManagement>
+</p:properties>
+</file>
+
 <file path=customXml/item5.xml><?xml version="1.0" encoding="utf-8"?>
 <?mso-contentType ?>
 <FormTemplates xmlns="http://schemas.microsoft.com/sharepoint/v3/contenttype/forms">
@@ -5994,24 +6076,6 @@
 </file>
 
 <file path=customXml/itemProps2.xml><?xml version="1.0" encoding="utf-8"?>
-<ds:datastoreItem xmlns:ds="http://schemas.openxmlformats.org/officeDocument/2006/customXml" ds:itemID="{63BF2DBE-B3C6-4D34-B356-7884C7C6B40A}">
-  <ds:schemaRefs>
-    <ds:schemaRef ds:uri="http://schemas.microsoft.com/office/2006/metadata/properties"/>
-    <ds:schemaRef ds:uri="http://schemas.microsoft.com/office/infopath/2007/PartnerControls"/>
-    <ds:schemaRef ds:uri="d0a21689-7831-42d6-ab5e-18dcb17ec99f"/>
-  </ds:schemaRefs>
-</ds:datastoreItem>
-</file>
-
-<file path=customXml/itemProps3.xml><?xml version="1.0" encoding="utf-8"?>
-<ds:datastoreItem xmlns:ds="http://schemas.openxmlformats.org/officeDocument/2006/customXml" ds:itemID="{EC88D164-0482-43B5-990B-67595C64CB30}">
-  <ds:schemaRefs>
-    <ds:schemaRef ds:uri="http://schemas.openxmlformats.org/officeDocument/2006/bibliography"/>
-  </ds:schemaRefs>
-</ds:datastoreItem>
-</file>
-
-<file path=customXml/itemProps4.xml><?xml version="1.0" encoding="utf-8"?>
 <ds:datastoreItem xmlns:ds="http://schemas.openxmlformats.org/officeDocument/2006/customXml" ds:itemID="{925D3E24-250F-4782-B012-5167B1716896}">
   <ds:schemaRefs>
     <ds:schemaRef ds:uri="http://schemas.microsoft.com/office/2006/metadata/contentType"/>
@@ -6029,6 +6093,24 @@
 </ds:datastoreItem>
 </file>
 
+<file path=customXml/itemProps3.xml><?xml version="1.0" encoding="utf-8"?>
+<ds:datastoreItem xmlns:ds="http://schemas.openxmlformats.org/officeDocument/2006/customXml" ds:itemID="{EC88D164-0482-43B5-990B-67595C64CB30}">
+  <ds:schemaRefs>
+    <ds:schemaRef ds:uri="http://schemas.openxmlformats.org/officeDocument/2006/bibliography"/>
+  </ds:schemaRefs>
+</ds:datastoreItem>
+</file>
+
+<file path=customXml/itemProps4.xml><?xml version="1.0" encoding="utf-8"?>
+<ds:datastoreItem xmlns:ds="http://schemas.openxmlformats.org/officeDocument/2006/customXml" ds:itemID="{63BF2DBE-B3C6-4D34-B356-7884C7C6B40A}">
+  <ds:schemaRefs>
+    <ds:schemaRef ds:uri="http://schemas.microsoft.com/office/2006/metadata/properties"/>
+    <ds:schemaRef ds:uri="http://schemas.microsoft.com/office/infopath/2007/PartnerControls"/>
+    <ds:schemaRef ds:uri="d0a21689-7831-42d6-ab5e-18dcb17ec99f"/>
+  </ds:schemaRefs>
+</ds:datastoreItem>
+</file>
+
 <file path=customXml/itemProps5.xml><?xml version="1.0" encoding="utf-8"?>
 <ds:datastoreItem xmlns:ds="http://schemas.openxmlformats.org/officeDocument/2006/customXml" ds:itemID="{028A07E9-5B73-4D12-85E2-5AA85E236A28}">
   <ds:schemaRefs>

</xml_diff>

<commit_message>
docs: remove redundant child.full_pn token help text in settings
</commit_message>
<xml_diff>
--- a/backend/wi_templates/ERA DOC-00011 - 55-00007 Rev.A - Nova Power Supply Sub-Assembly WI.docx
+++ b/backend/wi_templates/ERA DOC-00011 - 55-00007 Rev.A - Nova Power Supply Sub-Assembly WI.docx
@@ -371,8 +371,8 @@
       </w:tblPr>
       <w:tblGrid>
         <w:gridCol w:w="2315"/>
-        <w:gridCol w:w="4346"/>
-        <w:gridCol w:w="1969"/>
+        <w:gridCol w:w="4226"/>
+        <w:gridCol w:w="2089"/>
       </w:tblGrid>
       <w:tr>
         <w:trPr>
@@ -424,26 +424,10 @@
           </w:tcPr>
           <w:p>
             <w:r>
-              <w:t xml:space="preserve">{% for tool in </w:t>
-            </w:r>
-            <w:proofErr w:type="spellStart"/>
-            <w:r>
-              <w:t>unique_tools</w:t>
-            </w:r>
-            <w:proofErr w:type="spellEnd"/>
-            <w:r>
-              <w:t xml:space="preserve"> </w:t>
-            </w:r>
-            <w:proofErr w:type="gramStart"/>
-            <w:r>
-              <w:t>%}</w:t>
+              <w:t>{% for tool in unique_tools %}</w:t>
             </w:r>
             <w:r>
-              <w:t>{</w:t>
-            </w:r>
-            <w:proofErr w:type="gramEnd"/>
-            <w:r>
-              <w:t>{</w:t>
+              <w:t>{{</w:t>
             </w:r>
             <w:r>
               <w:t>tool</w:t>
@@ -461,17 +445,7 @@
               <w:t xml:space="preserve"> Rev.</w:t>
             </w:r>
             <w:r>
-              <w:t>{{</w:t>
-            </w:r>
-            <w:proofErr w:type="spellStart"/>
-            <w:proofErr w:type="gramStart"/>
-            <w:r>
-              <w:t>tool.revision</w:t>
-            </w:r>
-            <w:proofErr w:type="spellEnd"/>
-            <w:proofErr w:type="gramEnd"/>
-            <w:r>
-              <w:t>}}</w:t>
+              <w:t>{{tool.revision}}</w:t>
             </w:r>
           </w:p>
         </w:tc>
@@ -485,17 +459,7 @@
               <w:cnfStyle w:val="000000100000" w:firstRow="0" w:lastRow="0" w:firstColumn="0" w:lastColumn="0" w:oddVBand="0" w:evenVBand="0" w:oddHBand="1" w:evenHBand="0" w:firstRowFirstColumn="0" w:firstRowLastColumn="0" w:lastRowFirstColumn="0" w:lastRowLastColumn="0"/>
             </w:pPr>
             <w:r>
-              <w:t>{{</w:t>
-            </w:r>
-            <w:proofErr w:type="spellStart"/>
-            <w:proofErr w:type="gramStart"/>
-            <w:r>
-              <w:t>tool.description</w:t>
-            </w:r>
-            <w:proofErr w:type="spellEnd"/>
-            <w:proofErr w:type="gramEnd"/>
-            <w:r>
-              <w:t>}}</w:t>
+              <w:t>{{tool.description}}</w:t>
             </w:r>
           </w:p>
         </w:tc>
@@ -508,33 +472,22 @@
               <w:cnfStyle w:val="000000100000" w:firstRow="0" w:lastRow="0" w:firstColumn="0" w:lastColumn="0" w:oddVBand="0" w:evenVBand="0" w:oddHBand="1" w:evenHBand="0" w:firstRowFirstColumn="0" w:firstRowLastColumn="0" w:lastRowFirstColumn="0" w:lastRowLastColumn="0"/>
             </w:pPr>
             <w:r>
-              <w:t>{{</w:t>
+              <w:t>{{tool.image</w:t>
             </w:r>
-            <w:proofErr w:type="spellStart"/>
-            <w:proofErr w:type="gramStart"/>
             <w:r>
-              <w:t>tool.image</w:t>
+              <w:t> | width:</w:t>
             </w:r>
-            <w:proofErr w:type="spellEnd"/>
-            <w:proofErr w:type="gramEnd"/>
             <w:r>
-              <w:t> | width:3.5cm</w:t>
+              <w:t>2.5</w:t>
             </w:r>
-            <w:proofErr w:type="gramStart"/>
             <w:r>
-              <w:t>}}{</w:t>
+              <w:t>4</w:t>
             </w:r>
-            <w:proofErr w:type="gramEnd"/>
             <w:r>
-              <w:t xml:space="preserve">% </w:t>
+              <w:t>cm</w:t>
             </w:r>
-            <w:proofErr w:type="spellStart"/>
             <w:r>
-              <w:t>endfor</w:t>
-            </w:r>
-            <w:proofErr w:type="spellEnd"/>
-            <w:r>
-              <w:t xml:space="preserve"> %}</w:t>
+              <w:t>}}{% endfor %}</w:t>
             </w:r>
           </w:p>
         </w:tc>
@@ -653,9 +606,9 @@
         <w:tblLook w:val="04A0" w:firstRow="1" w:lastRow="0" w:firstColumn="1" w:lastColumn="0" w:noHBand="0" w:noVBand="1"/>
       </w:tblPr>
       <w:tblGrid>
-        <w:gridCol w:w="1885"/>
-        <w:gridCol w:w="4987"/>
-        <w:gridCol w:w="1758"/>
+        <w:gridCol w:w="2230"/>
+        <w:gridCol w:w="4311"/>
+        <w:gridCol w:w="2089"/>
       </w:tblGrid>
       <w:tr>
         <w:trPr>
@@ -705,7 +658,20 @@
             <w:cnfStyle w:val="001000000000" w:firstRow="0" w:lastRow="0" w:firstColumn="1" w:lastColumn="0" w:oddVBand="0" w:evenVBand="0" w:oddHBand="0" w:evenHBand="0" w:firstRowFirstColumn="0" w:firstRowLastColumn="0" w:lastRowFirstColumn="0" w:lastRowLastColumn="0"/>
             <w:tcW w:w="1885" w:type="dxa"/>
           </w:tcPr>
-          <w:p/>
+          <w:p>
+            <w:r>
+              <w:t>{% for child in bom_items %}</w:t>
+            </w:r>
+            <w:r>
+              <w:t>{{</w:t>
+            </w:r>
+            <w:r>
+              <w:t>child.full_pn</w:t>
+            </w:r>
+            <w:r>
+              <w:t>}}</w:t>
+            </w:r>
+          </w:p>
         </w:tc>
         <w:tc>
           <w:tcPr>
@@ -715,6 +681,9 @@
             <w:pPr>
               <w:cnfStyle w:val="000000100000" w:firstRow="0" w:lastRow="0" w:firstColumn="0" w:lastColumn="0" w:oddVBand="0" w:evenVBand="0" w:oddHBand="1" w:evenHBand="0" w:firstRowFirstColumn="0" w:firstRowLastColumn="0" w:lastRowFirstColumn="0" w:lastRowLastColumn="0"/>
             </w:pPr>
+            <w:r>
+              <w:t>{{child.description}}</w:t>
+            </w:r>
           </w:p>
         </w:tc>
         <w:tc>
@@ -725,6 +694,24 @@
             <w:pPr>
               <w:cnfStyle w:val="000000100000" w:firstRow="0" w:lastRow="0" w:firstColumn="0" w:lastColumn="0" w:oddVBand="0" w:evenVBand="0" w:oddHBand="1" w:evenHBand="0" w:firstRowFirstColumn="0" w:firstRowLastColumn="0" w:lastRowFirstColumn="0" w:lastRowLastColumn="0"/>
             </w:pPr>
+            <w:r>
+              <w:t>{{child.image</w:t>
+            </w:r>
+            <w:r>
+              <w:t> | width:</w:t>
+            </w:r>
+            <w:r>
+              <w:t>2.54</w:t>
+            </w:r>
+            <w:r>
+              <w:t>cm</w:t>
+            </w:r>
+            <w:r>
+              <w:t>}}</w:t>
+            </w:r>
+            <w:r>
+              <w:t>{% endfor %}</w:t>
+            </w:r>
           </w:p>
         </w:tc>
       </w:tr>
@@ -4985,7 +4972,9 @@
     <w:rsid w:val="004C5C1A"/>
     <w:rsid w:val="005901F2"/>
     <w:rsid w:val="00612982"/>
+    <w:rsid w:val="00623723"/>
     <w:rsid w:val="00624F1E"/>
+    <w:rsid w:val="006274C3"/>
     <w:rsid w:val="007B6D06"/>
     <w:rsid w:val="007D0F26"/>
     <w:rsid w:val="007E2697"/>
@@ -5841,6 +5830,28 @@
 </file>
 
 <file path=customXml/item2.xml><?xml version="1.0" encoding="utf-8"?>
+<p:properties xmlns:p="http://schemas.microsoft.com/office/2006/metadata/properties" xmlns:xsi="http://www.w3.org/2001/XMLSchema-instance" xmlns:pc="http://schemas.microsoft.com/office/infopath/2007/PartnerControls">
+  <documentManagement>
+    <Revision xmlns="d0a21689-7831-42d6-ab5e-18dcb17ec99f">A</Revision>
+    <DocumentID xmlns="d0a21689-7831-42d6-ab5e-18dcb17ec99f">DOC-00011</DocumentID>
+    <Confidentiality xmlns="d0a21689-7831-42d6-ab5e-18dcb17ec99f">Internal</Confidentiality>
+    <Status xmlns="d0a21689-7831-42d6-ab5e-18dcb17ec99f">Preliminary</Status>
+    <AssignedMaintainer xmlns="d0a21689-7831-42d6-ab5e-18dcb17ec99f">
+      <UserInfo>
+        <DisplayName>Slava Thereshin</DisplayName>
+        <AccountId>11</AccountId>
+        <AccountType/>
+      </UserInfo>
+    </AssignedMaintainer>
+  </documentManagement>
+</p:properties>
+</file>
+
+<file path=customXml/item3.xml><?xml version="1.0" encoding="utf-8"?>
+<b:Sources xmlns:b="http://schemas.openxmlformats.org/officeDocument/2006/bibliography" xmlns="http://schemas.openxmlformats.org/officeDocument/2006/bibliography" SelectedStyle="\APASixthEditionOfficeOnline.xsl" StyleName="APA" Version="6"/>
+</file>
+
+<file path=customXml/item4.xml><?xml version="1.0" encoding="utf-8"?>
 <ct:contentTypeSchema xmlns:ct="http://schemas.microsoft.com/office/2006/metadata/contentType" xmlns:ma="http://schemas.microsoft.com/office/2006/metadata/properties/metaAttributes" ct:_="" ma:_="" ma:contentTypeName="Document" ma:contentTypeID="0x01010097E3F458759F934FBF98477861B30E17" ma:contentTypeVersion="9" ma:contentTypeDescription="Create a new document." ma:contentTypeScope="" ma:versionID="20bd56559113204125d9b5a00727f95e">
   <xsd:schema xmlns:xsd="http://www.w3.org/2001/XMLSchema" xmlns:xs="http://www.w3.org/2001/XMLSchema" xmlns:p="http://schemas.microsoft.com/office/2006/metadata/properties" xmlns:ns2="d0a21689-7831-42d6-ab5e-18dcb17ec99f" targetNamespace="http://schemas.microsoft.com/office/2006/metadata/properties" ma:root="true" ma:fieldsID="1a465cdb4615ac0d137ed4d3b9785716" ns2:_="">
     <xsd:import namespace="d0a21689-7831-42d6-ab5e-18dcb17ec99f"/>
@@ -6036,28 +6047,6 @@
 </ct:contentTypeSchema>
 </file>
 
-<file path=customXml/item3.xml><?xml version="1.0" encoding="utf-8"?>
-<b:Sources xmlns:b="http://schemas.openxmlformats.org/officeDocument/2006/bibliography" xmlns="http://schemas.openxmlformats.org/officeDocument/2006/bibliography" SelectedStyle="\APASixthEditionOfficeOnline.xsl" StyleName="APA" Version="6"/>
-</file>
-
-<file path=customXml/item4.xml><?xml version="1.0" encoding="utf-8"?>
-<p:properties xmlns:p="http://schemas.microsoft.com/office/2006/metadata/properties" xmlns:xsi="http://www.w3.org/2001/XMLSchema-instance" xmlns:pc="http://schemas.microsoft.com/office/infopath/2007/PartnerControls">
-  <documentManagement>
-    <Revision xmlns="d0a21689-7831-42d6-ab5e-18dcb17ec99f">A</Revision>
-    <DocumentID xmlns="d0a21689-7831-42d6-ab5e-18dcb17ec99f">DOC-00011</DocumentID>
-    <Confidentiality xmlns="d0a21689-7831-42d6-ab5e-18dcb17ec99f">Internal</Confidentiality>
-    <Status xmlns="d0a21689-7831-42d6-ab5e-18dcb17ec99f">Preliminary</Status>
-    <AssignedMaintainer xmlns="d0a21689-7831-42d6-ab5e-18dcb17ec99f">
-      <UserInfo>
-        <DisplayName>Slava Thereshin</DisplayName>
-        <AccountId>11</AccountId>
-        <AccountType/>
-      </UserInfo>
-    </AssignedMaintainer>
-  </documentManagement>
-</p:properties>
-</file>
-
 <file path=customXml/item5.xml><?xml version="1.0" encoding="utf-8"?>
 <?mso-contentType ?>
 <FormTemplates xmlns="http://schemas.microsoft.com/sharepoint/v3/contenttype/forms">
@@ -6076,6 +6065,24 @@
 </file>
 
 <file path=customXml/itemProps2.xml><?xml version="1.0" encoding="utf-8"?>
+<ds:datastoreItem xmlns:ds="http://schemas.openxmlformats.org/officeDocument/2006/customXml" ds:itemID="{63BF2DBE-B3C6-4D34-B356-7884C7C6B40A}">
+  <ds:schemaRefs>
+    <ds:schemaRef ds:uri="http://schemas.microsoft.com/office/2006/metadata/properties"/>
+    <ds:schemaRef ds:uri="http://schemas.microsoft.com/office/infopath/2007/PartnerControls"/>
+    <ds:schemaRef ds:uri="d0a21689-7831-42d6-ab5e-18dcb17ec99f"/>
+  </ds:schemaRefs>
+</ds:datastoreItem>
+</file>
+
+<file path=customXml/itemProps3.xml><?xml version="1.0" encoding="utf-8"?>
+<ds:datastoreItem xmlns:ds="http://schemas.openxmlformats.org/officeDocument/2006/customXml" ds:itemID="{EC88D164-0482-43B5-990B-67595C64CB30}">
+  <ds:schemaRefs>
+    <ds:schemaRef ds:uri="http://schemas.openxmlformats.org/officeDocument/2006/bibliography"/>
+  </ds:schemaRefs>
+</ds:datastoreItem>
+</file>
+
+<file path=customXml/itemProps4.xml><?xml version="1.0" encoding="utf-8"?>
 <ds:datastoreItem xmlns:ds="http://schemas.openxmlformats.org/officeDocument/2006/customXml" ds:itemID="{925D3E24-250F-4782-B012-5167B1716896}">
   <ds:schemaRefs>
     <ds:schemaRef ds:uri="http://schemas.microsoft.com/office/2006/metadata/contentType"/>
@@ -6093,24 +6100,6 @@
 </ds:datastoreItem>
 </file>
 
-<file path=customXml/itemProps3.xml><?xml version="1.0" encoding="utf-8"?>
-<ds:datastoreItem xmlns:ds="http://schemas.openxmlformats.org/officeDocument/2006/customXml" ds:itemID="{EC88D164-0482-43B5-990B-67595C64CB30}">
-  <ds:schemaRefs>
-    <ds:schemaRef ds:uri="http://schemas.openxmlformats.org/officeDocument/2006/bibliography"/>
-  </ds:schemaRefs>
-</ds:datastoreItem>
-</file>
-
-<file path=customXml/itemProps4.xml><?xml version="1.0" encoding="utf-8"?>
-<ds:datastoreItem xmlns:ds="http://schemas.openxmlformats.org/officeDocument/2006/customXml" ds:itemID="{63BF2DBE-B3C6-4D34-B356-7884C7C6B40A}">
-  <ds:schemaRefs>
-    <ds:schemaRef ds:uri="http://schemas.microsoft.com/office/2006/metadata/properties"/>
-    <ds:schemaRef ds:uri="http://schemas.microsoft.com/office/infopath/2007/PartnerControls"/>
-    <ds:schemaRef ds:uri="d0a21689-7831-42d6-ab5e-18dcb17ec99f"/>
-  </ds:schemaRefs>
-</ds:datastoreItem>
-</file>
-
 <file path=customXml/itemProps5.xml><?xml version="1.0" encoding="utf-8"?>
 <ds:datastoreItem xmlns:ds="http://schemas.openxmlformats.org/officeDocument/2006/customXml" ds:itemID="{028A07E9-5B73-4D12-85E2-5AA85E236A28}">
   <ds:schemaRefs>

</xml_diff>

<commit_message>
fix: preprocess paragraph-level text instead of split runs to handle docx width filters
</commit_message>
<xml_diff>
--- a/backend/wi_templates/ERA DOC-00011 - 55-00007 Rev.A - Nova Power Supply Sub-Assembly WI.docx
+++ b/backend/wi_templates/ERA DOC-00011 - 55-00007 Rev.A - Nova Power Supply Sub-Assembly WI.docx
@@ -424,28 +424,54 @@
           </w:tcPr>
           <w:p>
             <w:r>
-              <w:t>{% for tool in unique_tools %}</w:t>
+              <w:t xml:space="preserve">{% for tool in </w:t>
+            </w:r>
+            <w:proofErr w:type="spellStart"/>
+            <w:r>
+              <w:t>unique_tools</w:t>
+            </w:r>
+            <w:proofErr w:type="spellEnd"/>
+            <w:r>
+              <w:t xml:space="preserve"> </w:t>
+            </w:r>
+            <w:proofErr w:type="gramStart"/>
+            <w:r>
+              <w:t>%}</w:t>
+            </w:r>
+            <w:r>
+              <w:t>{</w:t>
+            </w:r>
+            <w:proofErr w:type="gramEnd"/>
+            <w:r>
+              <w:t>{</w:t>
+            </w:r>
+            <w:r>
+              <w:t>tool</w:t>
+            </w:r>
+            <w:r>
+              <w:t>.</w:t>
+            </w:r>
+            <w:r>
+              <w:t>pn</w:t>
+            </w:r>
+            <w:r>
+              <w:t>}}</w:t>
+            </w:r>
+            <w:r>
+              <w:t xml:space="preserve"> Rev.</w:t>
             </w:r>
             <w:r>
               <w:t>{{</w:t>
             </w:r>
-            <w:r>
-              <w:t>tool</w:t>
-            </w:r>
-            <w:r>
-              <w:t>.</w:t>
-            </w:r>
-            <w:r>
-              <w:t>pn</w:t>
-            </w:r>
+            <w:proofErr w:type="spellStart"/>
+            <w:proofErr w:type="gramStart"/>
+            <w:r>
+              <w:t>tool.revision</w:t>
+            </w:r>
+            <w:proofErr w:type="spellEnd"/>
+            <w:proofErr w:type="gramEnd"/>
             <w:r>
               <w:t>}}</w:t>
-            </w:r>
-            <w:r>
-              <w:t xml:space="preserve"> Rev.</w:t>
-            </w:r>
-            <w:r>
-              <w:t>{{tool.revision}}</w:t>
             </w:r>
           </w:p>
         </w:tc>
@@ -459,7 +485,17 @@
               <w:cnfStyle w:val="000000100000" w:firstRow="0" w:lastRow="0" w:firstColumn="0" w:lastColumn="0" w:oddVBand="0" w:evenVBand="0" w:oddHBand="1" w:evenHBand="0" w:firstRowFirstColumn="0" w:firstRowLastColumn="0" w:lastRowFirstColumn="0" w:lastRowLastColumn="0"/>
             </w:pPr>
             <w:r>
-              <w:t>{{tool.description}}</w:t>
+              <w:t>{{</w:t>
+            </w:r>
+            <w:proofErr w:type="spellStart"/>
+            <w:proofErr w:type="gramStart"/>
+            <w:r>
+              <w:t>tool.description</w:t>
+            </w:r>
+            <w:proofErr w:type="spellEnd"/>
+            <w:proofErr w:type="gramEnd"/>
+            <w:r>
+              <w:t>}}</w:t>
             </w:r>
           </w:p>
         </w:tc>
@@ -472,8 +508,15 @@
               <w:cnfStyle w:val="000000100000" w:firstRow="0" w:lastRow="0" w:firstColumn="0" w:lastColumn="0" w:oddVBand="0" w:evenVBand="0" w:oddHBand="1" w:evenHBand="0" w:firstRowFirstColumn="0" w:firstRowLastColumn="0" w:lastRowFirstColumn="0" w:lastRowLastColumn="0"/>
             </w:pPr>
             <w:r>
-              <w:t>{{tool.image</w:t>
-            </w:r>
+              <w:t>{{</w:t>
+            </w:r>
+            <w:proofErr w:type="spellStart"/>
+            <w:proofErr w:type="gramStart"/>
+            <w:r>
+              <w:t>tool.image</w:t>
+            </w:r>
+            <w:proofErr w:type="spellEnd"/>
+            <w:proofErr w:type="gramEnd"/>
             <w:r>
               <w:t> | width:</w:t>
             </w:r>
@@ -486,8 +529,21 @@
             <w:r>
               <w:t>cm</w:t>
             </w:r>
-            <w:r>
-              <w:t>}}{% endfor %}</w:t>
+            <w:proofErr w:type="gramStart"/>
+            <w:r>
+              <w:t>}}{</w:t>
+            </w:r>
+            <w:proofErr w:type="gramEnd"/>
+            <w:r>
+              <w:t xml:space="preserve">% </w:t>
+            </w:r>
+            <w:proofErr w:type="spellStart"/>
+            <w:r>
+              <w:t>endfor</w:t>
+            </w:r>
+            <w:proofErr w:type="spellEnd"/>
+            <w:r>
+              <w:t xml:space="preserve"> %}</w:t>
             </w:r>
           </w:p>
         </w:tc>
@@ -606,8 +662,8 @@
         <w:tblLook w:val="04A0" w:firstRow="1" w:lastRow="0" w:firstColumn="1" w:lastColumn="0" w:noHBand="0" w:noVBand="1"/>
       </w:tblPr>
       <w:tblGrid>
-        <w:gridCol w:w="2230"/>
-        <w:gridCol w:w="4311"/>
+        <w:gridCol w:w="2870"/>
+        <w:gridCol w:w="3671"/>
         <w:gridCol w:w="2089"/>
       </w:tblGrid>
       <w:tr>
@@ -660,14 +716,35 @@
           </w:tcPr>
           <w:p>
             <w:r>
-              <w:t>{% for child in bom_items %}</w:t>
-            </w:r>
-            <w:r>
-              <w:t>{{</w:t>
-            </w:r>
-            <w:r>
-              <w:t>child.full_pn</w:t>
-            </w:r>
+              <w:t xml:space="preserve">{% for child in </w:t>
+            </w:r>
+            <w:proofErr w:type="spellStart"/>
+            <w:r>
+              <w:t>bom_items</w:t>
+            </w:r>
+            <w:proofErr w:type="spellEnd"/>
+            <w:r>
+              <w:t xml:space="preserve"> </w:t>
+            </w:r>
+            <w:proofErr w:type="gramStart"/>
+            <w:r>
+              <w:t>%}</w:t>
+            </w:r>
+            <w:r>
+              <w:t>{</w:t>
+            </w:r>
+            <w:proofErr w:type="gramEnd"/>
+            <w:r>
+              <w:t>{</w:t>
+            </w:r>
+            <w:proofErr w:type="spellStart"/>
+            <w:r>
+              <w:t>child.</w:t>
+            </w:r>
+            <w:r>
+              <w:t>part_number</w:t>
+            </w:r>
+            <w:proofErr w:type="spellEnd"/>
             <w:r>
               <w:t>}}</w:t>
             </w:r>
@@ -682,7 +759,17 @@
               <w:cnfStyle w:val="000000100000" w:firstRow="0" w:lastRow="0" w:firstColumn="0" w:lastColumn="0" w:oddVBand="0" w:evenVBand="0" w:oddHBand="1" w:evenHBand="0" w:firstRowFirstColumn="0" w:firstRowLastColumn="0" w:lastRowFirstColumn="0" w:lastRowLastColumn="0"/>
             </w:pPr>
             <w:r>
-              <w:t>{{child.description}}</w:t>
+              <w:t>{{</w:t>
+            </w:r>
+            <w:proofErr w:type="spellStart"/>
+            <w:proofErr w:type="gramStart"/>
+            <w:r>
+              <w:t>child.description</w:t>
+            </w:r>
+            <w:proofErr w:type="spellEnd"/>
+            <w:proofErr w:type="gramEnd"/>
+            <w:r>
+              <w:t>}}</w:t>
             </w:r>
           </w:p>
         </w:tc>
@@ -695,8 +782,15 @@
               <w:cnfStyle w:val="000000100000" w:firstRow="0" w:lastRow="0" w:firstColumn="0" w:lastColumn="0" w:oddVBand="0" w:evenVBand="0" w:oddHBand="1" w:evenHBand="0" w:firstRowFirstColumn="0" w:firstRowLastColumn="0" w:lastRowFirstColumn="0" w:lastRowLastColumn="0"/>
             </w:pPr>
             <w:r>
-              <w:t>{{child.image</w:t>
-            </w:r>
+              <w:t>{{</w:t>
+            </w:r>
+            <w:proofErr w:type="spellStart"/>
+            <w:proofErr w:type="gramStart"/>
+            <w:r>
+              <w:t>child.image</w:t>
+            </w:r>
+            <w:proofErr w:type="spellEnd"/>
+            <w:proofErr w:type="gramEnd"/>
             <w:r>
               <w:t> | width:</w:t>
             </w:r>
@@ -706,11 +800,24 @@
             <w:r>
               <w:t>cm</w:t>
             </w:r>
+            <w:proofErr w:type="gramStart"/>
             <w:r>
               <w:t>}}</w:t>
             </w:r>
             <w:r>
-              <w:t>{% endfor %}</w:t>
+              <w:t>{</w:t>
+            </w:r>
+            <w:proofErr w:type="gramEnd"/>
+            <w:r>
+              <w:t xml:space="preserve">% </w:t>
+            </w:r>
+            <w:proofErr w:type="spellStart"/>
+            <w:r>
+              <w:t>endfor</w:t>
+            </w:r>
+            <w:proofErr w:type="spellEnd"/>
+            <w:r>
+              <w:t xml:space="preserve"> %}</w:t>
             </w:r>
           </w:p>
         </w:tc>
@@ -1115,7 +1222,6 @@
               <w:listItem w:value="[Confidentiality]"/>
             </w:dropDownList>
           </w:sdtPr>
-          <w:sdtEndPr/>
           <w:sdtContent>
             <w:p>
               <w:pPr>
@@ -1212,7 +1318,6 @@
               <w:dataBinding w:prefixMappings="xmlns:ns0='http://purl.org/dc/elements/1.1/' xmlns:ns1='http://schemas.openxmlformats.org/package/2006/metadata/core-properties' " w:xpath="/ns1:coreProperties[1]/ns0:title[1]" w:storeItemID="{6C3C8BC8-F283-45AE-878A-BAB7291924A1}"/>
               <w:text/>
             </w:sdtPr>
-            <w:sdtEndPr/>
             <w:sdtContent>
               <w:r>
                 <w:rPr>
@@ -1277,7 +1382,6 @@
               <w:dataBinding w:prefixMappings="xmlns:ns0='http://schemas.microsoft.com/office/2006/metadata/properties' xmlns:ns1='http://www.w3.org/2001/XMLSchema-instance' xmlns:ns2='http://schemas.microsoft.com/office/infopath/2007/PartnerControls' xmlns:ns3='d0a21689-7831-42d6-ab5e-18dcb17ec99f' xmlns:ns4='http://www.w3.org/2000/xmlns/' " w:xpath="/ns0:properties[1]/documentManagement[1]/ns3:DocumentID[1]" w:storeItemID="{63BF2DBE-B3C6-4D34-B356-7884C7C6B40A}"/>
               <w:text/>
             </w:sdtPr>
-            <w:sdtEndPr/>
             <w:sdtContent>
               <w:r>
                 <w:rPr>
@@ -1339,7 +1443,6 @@
               <w:dataBinding w:prefixMappings="xmlns:ns0='http://schemas.microsoft.com/office/2006/metadata/properties' xmlns:ns1='http://www.w3.org/2001/XMLSchema-instance' xmlns:ns2='http://schemas.microsoft.com/office/infopath/2007/PartnerControls' xmlns:ns3='d0a21689-7831-42d6-ab5e-18dcb17ec99f' " w:xpath="/ns0:properties[1]/documentManagement[1]/ns3:Revision[1]" w:storeItemID="{63BF2DBE-B3C6-4D34-B356-7884C7C6B40A}"/>
               <w:text/>
             </w:sdtPr>
-            <w:sdtEndPr/>
             <w:sdtContent>
               <w:r>
                 <w:rPr>
@@ -1636,7 +1739,6 @@
             <w:listItem w:value="[Release Status]"/>
           </w:dropDownList>
         </w:sdtPr>
-        <w:sdtEndPr/>
         <w:sdtContent>
           <w:tc>
             <w:tcPr>
@@ -1703,7 +1805,6 @@
               <w:listItem w:value="[Confidentiality]"/>
             </w:dropDownList>
           </w:sdtPr>
-          <w:sdtEndPr/>
           <w:sdtContent>
             <w:p>
               <w:pPr>
@@ -1829,7 +1930,6 @@
               <w:dataBinding w:prefixMappings="xmlns:ns0='http://purl.org/dc/elements/1.1/' xmlns:ns1='http://schemas.openxmlformats.org/package/2006/metadata/core-properties' " w:xpath="/ns1:coreProperties[1]/ns0:title[1]" w:storeItemID="{6C3C8BC8-F283-45AE-878A-BAB7291924A1}"/>
               <w:text/>
             </w:sdtPr>
-            <w:sdtEndPr/>
             <w:sdtContent>
               <w:r>
                 <w:rPr>
@@ -1886,7 +1986,6 @@
               <w:dataBinding w:prefixMappings="xmlns:ns0='http://schemas.microsoft.com/office/2006/metadata/properties' xmlns:ns1='http://www.w3.org/2001/XMLSchema-instance' xmlns:ns2='http://schemas.microsoft.com/office/infopath/2007/PartnerControls' xmlns:ns3='d0a21689-7831-42d6-ab5e-18dcb17ec99f' xmlns:ns4='http://www.w3.org/2000/xmlns/' " w:xpath="/ns0:properties[1]/documentManagement[1]/ns3:DocumentID[1]" w:storeItemID="{63BF2DBE-B3C6-4D34-B356-7884C7C6B40A}"/>
               <w:text/>
             </w:sdtPr>
-            <w:sdtEndPr/>
             <w:sdtContent>
               <w:r>
                 <w:rPr>
@@ -1949,7 +2048,6 @@
               <w:dataBinding w:prefixMappings="xmlns:ns0='http://schemas.microsoft.com/office/2006/metadata/properties' xmlns:ns1='http://www.w3.org/2001/XMLSchema-instance' xmlns:ns2='http://schemas.microsoft.com/office/infopath/2007/PartnerControls' xmlns:ns3='d0a21689-7831-42d6-ab5e-18dcb17ec99f' " w:xpath="/ns0:properties[1]/documentManagement[1]/ns3:Revision[1]" w:storeItemID="{63BF2DBE-B3C6-4D34-B356-7884C7C6B40A}"/>
               <w:text/>
             </w:sdtPr>
-            <w:sdtEndPr/>
             <w:sdtContent>
               <w:r>
                 <w:rPr>
@@ -2197,7 +2295,6 @@
                 <w:calendar w:val="gregorian"/>
               </w:date>
             </w:sdtPr>
-            <w:sdtEndPr/>
             <w:sdtContent>
               <w:r>
                 <w:rPr>
@@ -2259,7 +2356,6 @@
           <w:dataBinding w:prefixMappings="xmlns:ns0='http://schemas.microsoft.com/office/2006/metadata/properties' xmlns:ns1='http://www.w3.org/2001/XMLSchema-instance' xmlns:ns2='http://schemas.microsoft.com/office/infopath/2007/PartnerControls' xmlns:ns3='d0a21689-7831-42d6-ab5e-18dcb17ec99f' " w:xpath="/ns0:properties[1]/documentManagement[1]/ns3:AssignedMaintainer[1]/ns3:UserInfo[1]/ns3:DisplayName[1]" w:storeItemID="{63BF2DBE-B3C6-4D34-B356-7884C7C6B40A}"/>
           <w:text/>
         </w:sdtPr>
-        <w:sdtEndPr/>
         <w:sdtContent>
           <w:tc>
             <w:tcPr>
@@ -4975,6 +5071,7 @@
     <w:rsid w:val="00623723"/>
     <w:rsid w:val="00624F1E"/>
     <w:rsid w:val="006274C3"/>
+    <w:rsid w:val="006B25F5"/>
     <w:rsid w:val="007B6D06"/>
     <w:rsid w:val="007D0F26"/>
     <w:rsid w:val="007E2697"/>
@@ -4991,6 +5088,7 @@
     <w:rsid w:val="00D562BC"/>
     <w:rsid w:val="00DD550E"/>
     <w:rsid w:val="00DF3C0F"/>
+    <w:rsid w:val="00E25727"/>
     <w:rsid w:val="00E86696"/>
     <w:rsid w:val="00EC754A"/>
     <w:rsid w:val="00EE4B83"/>
@@ -5830,28 +5928,6 @@
 </file>
 
 <file path=customXml/item2.xml><?xml version="1.0" encoding="utf-8"?>
-<p:properties xmlns:p="http://schemas.microsoft.com/office/2006/metadata/properties" xmlns:xsi="http://www.w3.org/2001/XMLSchema-instance" xmlns:pc="http://schemas.microsoft.com/office/infopath/2007/PartnerControls">
-  <documentManagement>
-    <Revision xmlns="d0a21689-7831-42d6-ab5e-18dcb17ec99f">A</Revision>
-    <DocumentID xmlns="d0a21689-7831-42d6-ab5e-18dcb17ec99f">DOC-00011</DocumentID>
-    <Confidentiality xmlns="d0a21689-7831-42d6-ab5e-18dcb17ec99f">Internal</Confidentiality>
-    <Status xmlns="d0a21689-7831-42d6-ab5e-18dcb17ec99f">Preliminary</Status>
-    <AssignedMaintainer xmlns="d0a21689-7831-42d6-ab5e-18dcb17ec99f">
-      <UserInfo>
-        <DisplayName>Slava Thereshin</DisplayName>
-        <AccountId>11</AccountId>
-        <AccountType/>
-      </UserInfo>
-    </AssignedMaintainer>
-  </documentManagement>
-</p:properties>
-</file>
-
-<file path=customXml/item3.xml><?xml version="1.0" encoding="utf-8"?>
-<b:Sources xmlns:b="http://schemas.openxmlformats.org/officeDocument/2006/bibliography" xmlns="http://schemas.openxmlformats.org/officeDocument/2006/bibliography" SelectedStyle="\APASixthEditionOfficeOnline.xsl" StyleName="APA" Version="6"/>
-</file>
-
-<file path=customXml/item4.xml><?xml version="1.0" encoding="utf-8"?>
 <ct:contentTypeSchema xmlns:ct="http://schemas.microsoft.com/office/2006/metadata/contentType" xmlns:ma="http://schemas.microsoft.com/office/2006/metadata/properties/metaAttributes" ct:_="" ma:_="" ma:contentTypeName="Document" ma:contentTypeID="0x01010097E3F458759F934FBF98477861B30E17" ma:contentTypeVersion="9" ma:contentTypeDescription="Create a new document." ma:contentTypeScope="" ma:versionID="20bd56559113204125d9b5a00727f95e">
   <xsd:schema xmlns:xsd="http://www.w3.org/2001/XMLSchema" xmlns:xs="http://www.w3.org/2001/XMLSchema" xmlns:p="http://schemas.microsoft.com/office/2006/metadata/properties" xmlns:ns2="d0a21689-7831-42d6-ab5e-18dcb17ec99f" targetNamespace="http://schemas.microsoft.com/office/2006/metadata/properties" ma:root="true" ma:fieldsID="1a465cdb4615ac0d137ed4d3b9785716" ns2:_="">
     <xsd:import namespace="d0a21689-7831-42d6-ab5e-18dcb17ec99f"/>
@@ -6047,6 +6123,28 @@
 </ct:contentTypeSchema>
 </file>
 
+<file path=customXml/item3.xml><?xml version="1.0" encoding="utf-8"?>
+<b:Sources xmlns:b="http://schemas.openxmlformats.org/officeDocument/2006/bibliography" xmlns="http://schemas.openxmlformats.org/officeDocument/2006/bibliography" SelectedStyle="\APASixthEditionOfficeOnline.xsl" StyleName="APA" Version="6"/>
+</file>
+
+<file path=customXml/item4.xml><?xml version="1.0" encoding="utf-8"?>
+<p:properties xmlns:p="http://schemas.microsoft.com/office/2006/metadata/properties" xmlns:xsi="http://www.w3.org/2001/XMLSchema-instance" xmlns:pc="http://schemas.microsoft.com/office/infopath/2007/PartnerControls">
+  <documentManagement>
+    <Revision xmlns="d0a21689-7831-42d6-ab5e-18dcb17ec99f">A</Revision>
+    <DocumentID xmlns="d0a21689-7831-42d6-ab5e-18dcb17ec99f">DOC-00011</DocumentID>
+    <Confidentiality xmlns="d0a21689-7831-42d6-ab5e-18dcb17ec99f">Internal</Confidentiality>
+    <Status xmlns="d0a21689-7831-42d6-ab5e-18dcb17ec99f">Preliminary</Status>
+    <AssignedMaintainer xmlns="d0a21689-7831-42d6-ab5e-18dcb17ec99f">
+      <UserInfo>
+        <DisplayName>Slava Thereshin</DisplayName>
+        <AccountId>11</AccountId>
+        <AccountType/>
+      </UserInfo>
+    </AssignedMaintainer>
+  </documentManagement>
+</p:properties>
+</file>
+
 <file path=customXml/item5.xml><?xml version="1.0" encoding="utf-8"?>
 <?mso-contentType ?>
 <FormTemplates xmlns="http://schemas.microsoft.com/sharepoint/v3/contenttype/forms">
@@ -6065,24 +6163,6 @@
 </file>
 
 <file path=customXml/itemProps2.xml><?xml version="1.0" encoding="utf-8"?>
-<ds:datastoreItem xmlns:ds="http://schemas.openxmlformats.org/officeDocument/2006/customXml" ds:itemID="{63BF2DBE-B3C6-4D34-B356-7884C7C6B40A}">
-  <ds:schemaRefs>
-    <ds:schemaRef ds:uri="http://schemas.microsoft.com/office/2006/metadata/properties"/>
-    <ds:schemaRef ds:uri="http://schemas.microsoft.com/office/infopath/2007/PartnerControls"/>
-    <ds:schemaRef ds:uri="d0a21689-7831-42d6-ab5e-18dcb17ec99f"/>
-  </ds:schemaRefs>
-</ds:datastoreItem>
-</file>
-
-<file path=customXml/itemProps3.xml><?xml version="1.0" encoding="utf-8"?>
-<ds:datastoreItem xmlns:ds="http://schemas.openxmlformats.org/officeDocument/2006/customXml" ds:itemID="{EC88D164-0482-43B5-990B-67595C64CB30}">
-  <ds:schemaRefs>
-    <ds:schemaRef ds:uri="http://schemas.openxmlformats.org/officeDocument/2006/bibliography"/>
-  </ds:schemaRefs>
-</ds:datastoreItem>
-</file>
-
-<file path=customXml/itemProps4.xml><?xml version="1.0" encoding="utf-8"?>
 <ds:datastoreItem xmlns:ds="http://schemas.openxmlformats.org/officeDocument/2006/customXml" ds:itemID="{925D3E24-250F-4782-B012-5167B1716896}">
   <ds:schemaRefs>
     <ds:schemaRef ds:uri="http://schemas.microsoft.com/office/2006/metadata/contentType"/>
@@ -6100,6 +6180,24 @@
 </ds:datastoreItem>
 </file>
 
+<file path=customXml/itemProps3.xml><?xml version="1.0" encoding="utf-8"?>
+<ds:datastoreItem xmlns:ds="http://schemas.openxmlformats.org/officeDocument/2006/customXml" ds:itemID="{EC88D164-0482-43B5-990B-67595C64CB30}">
+  <ds:schemaRefs>
+    <ds:schemaRef ds:uri="http://schemas.openxmlformats.org/officeDocument/2006/bibliography"/>
+  </ds:schemaRefs>
+</ds:datastoreItem>
+</file>
+
+<file path=customXml/itemProps4.xml><?xml version="1.0" encoding="utf-8"?>
+<ds:datastoreItem xmlns:ds="http://schemas.openxmlformats.org/officeDocument/2006/customXml" ds:itemID="{63BF2DBE-B3C6-4D34-B356-7884C7C6B40A}">
+  <ds:schemaRefs>
+    <ds:schemaRef ds:uri="http://schemas.microsoft.com/office/2006/metadata/properties"/>
+    <ds:schemaRef ds:uri="http://schemas.microsoft.com/office/infopath/2007/PartnerControls"/>
+    <ds:schemaRef ds:uri="d0a21689-7831-42d6-ab5e-18dcb17ec99f"/>
+  </ds:schemaRefs>
+</ds:datastoreItem>
+</file>
+
 <file path=customXml/itemProps5.xml><?xml version="1.0" encoding="utf-8"?>
 <ds:datastoreItem xmlns:ds="http://schemas.openxmlformats.org/officeDocument/2006/customXml" ds:itemID="{028A07E9-5B73-4D12-85E2-5AA85E236A28}">
   <ds:schemaRefs>

</xml_diff>

<commit_message>
fix: add full_pn to KNOWN_TOKENS and sub-property whitelist in scan_template
</commit_message>
<xml_diff>
--- a/backend/wi_templates/ERA DOC-00011 - 55-00007 Rev.A - Nova Power Supply Sub-Assembly WI.docx
+++ b/backend/wi_templates/ERA DOC-00011 - 55-00007 Rev.A - Nova Power Supply Sub-Assembly WI.docx
@@ -132,7 +132,7 @@
         <w:t xml:space="preserve">Detailed assembly instructions, guiding the production technician to assemble the </w:t>
       </w:r>
       <w:r>
-        <w:t>Nova Power Supply Sub-Assembly</w:t>
+        <w:t>{{description}}</w:t>
       </w:r>
       <w:r>
         <w:t xml:space="preserve"> </w:t>
@@ -141,13 +141,7 @@
         <w:t>(</w:t>
       </w:r>
       <w:r>
-        <w:t>55-0000</w:t>
-      </w:r>
-      <w:r>
-        <w:t>7</w:t>
-      </w:r>
-      <w:r>
-        <w:t xml:space="preserve"> Rev.A</w:t>
+        <w:t>{{full_pn}}</w:t>
       </w:r>
       <w:r>
         <w:t>)</w:t>
@@ -424,26 +418,10 @@
           </w:tcPr>
           <w:p>
             <w:r>
-              <w:t xml:space="preserve">{% for tool in </w:t>
-            </w:r>
-            <w:proofErr w:type="spellStart"/>
-            <w:r>
-              <w:t>unique_tools</w:t>
-            </w:r>
-            <w:proofErr w:type="spellEnd"/>
-            <w:r>
-              <w:t xml:space="preserve"> </w:t>
-            </w:r>
-            <w:proofErr w:type="gramStart"/>
-            <w:r>
-              <w:t>%}</w:t>
-            </w:r>
-            <w:r>
-              <w:t>{</w:t>
-            </w:r>
-            <w:proofErr w:type="gramEnd"/>
-            <w:r>
-              <w:t>{</w:t>
+              <w:t>{% for tool in unique_tools %}</w:t>
+            </w:r>
+            <w:r>
+              <w:t>{{</w:t>
             </w:r>
             <w:r>
               <w:t>tool</w:t>
@@ -461,17 +439,7 @@
               <w:t xml:space="preserve"> Rev.</w:t>
             </w:r>
             <w:r>
-              <w:t>{{</w:t>
-            </w:r>
-            <w:proofErr w:type="spellStart"/>
-            <w:proofErr w:type="gramStart"/>
-            <w:r>
-              <w:t>tool.revision</w:t>
-            </w:r>
-            <w:proofErr w:type="spellEnd"/>
-            <w:proofErr w:type="gramEnd"/>
-            <w:r>
-              <w:t>}}</w:t>
+              <w:t>{{tool.revision}}</w:t>
             </w:r>
           </w:p>
         </w:tc>
@@ -485,17 +453,7 @@
               <w:cnfStyle w:val="000000100000" w:firstRow="0" w:lastRow="0" w:firstColumn="0" w:lastColumn="0" w:oddVBand="0" w:evenVBand="0" w:oddHBand="1" w:evenHBand="0" w:firstRowFirstColumn="0" w:firstRowLastColumn="0" w:lastRowFirstColumn="0" w:lastRowLastColumn="0"/>
             </w:pPr>
             <w:r>
-              <w:t>{{</w:t>
-            </w:r>
-            <w:proofErr w:type="spellStart"/>
-            <w:proofErr w:type="gramStart"/>
-            <w:r>
-              <w:t>tool.description</w:t>
-            </w:r>
-            <w:proofErr w:type="spellEnd"/>
-            <w:proofErr w:type="gramEnd"/>
-            <w:r>
-              <w:t>}}</w:t>
+              <w:t>{{tool.description}}</w:t>
             </w:r>
           </w:p>
         </w:tc>
@@ -508,15 +466,8 @@
               <w:cnfStyle w:val="000000100000" w:firstRow="0" w:lastRow="0" w:firstColumn="0" w:lastColumn="0" w:oddVBand="0" w:evenVBand="0" w:oddHBand="1" w:evenHBand="0" w:firstRowFirstColumn="0" w:firstRowLastColumn="0" w:lastRowFirstColumn="0" w:lastRowLastColumn="0"/>
             </w:pPr>
             <w:r>
-              <w:t>{{</w:t>
-            </w:r>
-            <w:proofErr w:type="spellStart"/>
-            <w:proofErr w:type="gramStart"/>
-            <w:r>
-              <w:t>tool.image</w:t>
-            </w:r>
-            <w:proofErr w:type="spellEnd"/>
-            <w:proofErr w:type="gramEnd"/>
+              <w:t>{{tool.image</w:t>
+            </w:r>
             <w:r>
               <w:t> | width:</w:t>
             </w:r>
@@ -529,21 +480,8 @@
             <w:r>
               <w:t>cm</w:t>
             </w:r>
-            <w:proofErr w:type="gramStart"/>
-            <w:r>
-              <w:t>}}{</w:t>
-            </w:r>
-            <w:proofErr w:type="gramEnd"/>
-            <w:r>
-              <w:t xml:space="preserve">% </w:t>
-            </w:r>
-            <w:proofErr w:type="spellStart"/>
-            <w:r>
-              <w:t>endfor</w:t>
-            </w:r>
-            <w:proofErr w:type="spellEnd"/>
-            <w:r>
-              <w:t xml:space="preserve"> %}</w:t>
+            <w:r>
+              <w:t>}}{% endfor %}</w:t>
             </w:r>
           </w:p>
         </w:tc>
@@ -651,7 +589,26 @@
       <w:pPr>
         <w:pStyle w:val="Heading1"/>
       </w:pPr>
+    </w:p>
+    <w:p>
+      <w:pPr>
+        <w:rPr>
+          <w:rFonts w:asciiTheme="majorHAnsi" w:eastAsiaTheme="majorEastAsia" w:hAnsiTheme="majorHAnsi" w:cstheme="majorBidi"/>
+          <w:color w:val="0F4761" w:themeColor="accent1" w:themeShade="BF"/>
+          <w:sz w:val="32"/>
+          <w:szCs w:val="32"/>
+        </w:rPr>
+      </w:pPr>
       <w:r>
+        <w:br w:type="page"/>
+      </w:r>
+    </w:p>
+    <w:p>
+      <w:pPr>
+        <w:pStyle w:val="Heading1"/>
+      </w:pPr>
+      <w:r>
+        <w:lastRenderedPageBreak/>
         <w:t>Part list</w:t>
       </w:r>
     </w:p>
@@ -716,35 +673,17 @@
           </w:tcPr>
           <w:p>
             <w:r>
-              <w:t xml:space="preserve">{% for child in </w:t>
-            </w:r>
-            <w:proofErr w:type="spellStart"/>
-            <w:r>
-              <w:t>bom_items</w:t>
-            </w:r>
-            <w:proofErr w:type="spellEnd"/>
-            <w:r>
-              <w:t xml:space="preserve"> </w:t>
-            </w:r>
-            <w:proofErr w:type="gramStart"/>
-            <w:r>
-              <w:t>%}</w:t>
-            </w:r>
-            <w:r>
-              <w:t>{</w:t>
-            </w:r>
-            <w:proofErr w:type="gramEnd"/>
-            <w:r>
-              <w:t>{</w:t>
-            </w:r>
-            <w:proofErr w:type="spellStart"/>
+              <w:t>{% for child in bom_items %}</w:t>
+            </w:r>
+            <w:r>
+              <w:t>{{</w:t>
+            </w:r>
             <w:r>
               <w:t>child.</w:t>
             </w:r>
             <w:r>
               <w:t>part_number</w:t>
             </w:r>
-            <w:proofErr w:type="spellEnd"/>
             <w:r>
               <w:t>}}</w:t>
             </w:r>
@@ -759,17 +698,7 @@
               <w:cnfStyle w:val="000000100000" w:firstRow="0" w:lastRow="0" w:firstColumn="0" w:lastColumn="0" w:oddVBand="0" w:evenVBand="0" w:oddHBand="1" w:evenHBand="0" w:firstRowFirstColumn="0" w:firstRowLastColumn="0" w:lastRowFirstColumn="0" w:lastRowLastColumn="0"/>
             </w:pPr>
             <w:r>
-              <w:t>{{</w:t>
-            </w:r>
-            <w:proofErr w:type="spellStart"/>
-            <w:proofErr w:type="gramStart"/>
-            <w:r>
-              <w:t>child.description</w:t>
-            </w:r>
-            <w:proofErr w:type="spellEnd"/>
-            <w:proofErr w:type="gramEnd"/>
-            <w:r>
-              <w:t>}}</w:t>
+              <w:t>{{child.description}}</w:t>
             </w:r>
           </w:p>
         </w:tc>
@@ -782,15 +711,8 @@
               <w:cnfStyle w:val="000000100000" w:firstRow="0" w:lastRow="0" w:firstColumn="0" w:lastColumn="0" w:oddVBand="0" w:evenVBand="0" w:oddHBand="1" w:evenHBand="0" w:firstRowFirstColumn="0" w:firstRowLastColumn="0" w:lastRowFirstColumn="0" w:lastRowLastColumn="0"/>
             </w:pPr>
             <w:r>
-              <w:t>{{</w:t>
-            </w:r>
-            <w:proofErr w:type="spellStart"/>
-            <w:proofErr w:type="gramStart"/>
-            <w:r>
-              <w:t>child.image</w:t>
-            </w:r>
-            <w:proofErr w:type="spellEnd"/>
-            <w:proofErr w:type="gramEnd"/>
+              <w:t>{{child.image</w:t>
+            </w:r>
             <w:r>
               <w:t> | width:</w:t>
             </w:r>
@@ -800,24 +722,11 @@
             <w:r>
               <w:t>cm</w:t>
             </w:r>
-            <w:proofErr w:type="gramStart"/>
             <w:r>
               <w:t>}}</w:t>
             </w:r>
             <w:r>
-              <w:t>{</w:t>
-            </w:r>
-            <w:proofErr w:type="gramEnd"/>
-            <w:r>
-              <w:t xml:space="preserve">% </w:t>
-            </w:r>
-            <w:proofErr w:type="spellStart"/>
-            <w:r>
-              <w:t>endfor</w:t>
-            </w:r>
-            <w:proofErr w:type="spellEnd"/>
-            <w:r>
-              <w:t xml:space="preserve"> %}</w:t>
+              <w:t>{% endfor %}</w:t>
             </w:r>
           </w:p>
         </w:tc>
@@ -830,7 +739,26 @@
       <w:r>
         <w:t xml:space="preserve"> </w:t>
       </w:r>
+    </w:p>
+    <w:p>
+      <w:pPr>
+        <w:rPr>
+          <w:rFonts w:asciiTheme="majorHAnsi" w:eastAsiaTheme="majorEastAsia" w:hAnsiTheme="majorHAnsi" w:cstheme="majorBidi"/>
+          <w:color w:val="0F4761" w:themeColor="accent1" w:themeShade="BF"/>
+          <w:sz w:val="32"/>
+          <w:szCs w:val="32"/>
+        </w:rPr>
+      </w:pPr>
       <w:r>
+        <w:br w:type="page"/>
+      </w:r>
+    </w:p>
+    <w:p>
+      <w:pPr>
+        <w:pStyle w:val="Heading1"/>
+      </w:pPr>
+      <w:r>
+        <w:lastRenderedPageBreak/>
         <w:t>Instructions</w:t>
       </w:r>
     </w:p>
@@ -841,9 +769,9 @@
         <w:tblLook w:val="04A0" w:firstRow="1" w:lastRow="0" w:firstColumn="1" w:lastColumn="0" w:noHBand="0" w:noVBand="1"/>
       </w:tblPr>
       <w:tblGrid>
-        <w:gridCol w:w="510"/>
-        <w:gridCol w:w="6674"/>
-        <w:gridCol w:w="1659"/>
+        <w:gridCol w:w="2749"/>
+        <w:gridCol w:w="3999"/>
+        <w:gridCol w:w="2095"/>
       </w:tblGrid>
       <w:tr>
         <w:trPr>
@@ -898,7 +826,10 @@
           </w:tcPr>
           <w:p>
             <w:r>
-              <w:t>1</w:t>
+              <w:t>{% for step in steps %}</w:t>
+            </w:r>
+            <w:r>
+              <w:t>{{step.step_number}}</w:t>
             </w:r>
           </w:p>
         </w:tc>
@@ -914,6 +845,13 @@
                 <w:bCs/>
               </w:rPr>
             </w:pPr>
+            <w:r>
+              <w:rPr>
+                <w:b/>
+                <w:bCs/>
+              </w:rPr>
+              <w:t>{{step.instruction_text}}</w:t>
+            </w:r>
           </w:p>
         </w:tc>
         <w:tc>
@@ -924,6 +862,24 @@
             <w:pPr>
               <w:cnfStyle w:val="000000100000" w:firstRow="0" w:lastRow="0" w:firstColumn="0" w:lastColumn="0" w:oddVBand="0" w:evenVBand="0" w:oddHBand="1" w:evenHBand="0" w:firstRowFirstColumn="0" w:firstRowLastColumn="0" w:lastRowFirstColumn="0" w:lastRowLastColumn="0"/>
             </w:pPr>
+            <w:r>
+              <w:t>{{step.step_image</w:t>
+            </w:r>
+            <w:r>
+              <w:t> | width:</w:t>
+            </w:r>
+            <w:r>
+              <w:t>2.54</w:t>
+            </w:r>
+            <w:r>
+              <w:t>cm</w:t>
+            </w:r>
+            <w:r>
+              <w:t>}}</w:t>
+            </w:r>
+            <w:r>
+              <w:t>{% endfor %}</w:t>
+            </w:r>
           </w:p>
         </w:tc>
       </w:tr>
@@ -1222,6 +1178,7 @@
               <w:listItem w:value="[Confidentiality]"/>
             </w:dropDownList>
           </w:sdtPr>
+          <w:sdtEndPr/>
           <w:sdtContent>
             <w:p>
               <w:pPr>
@@ -1318,6 +1275,7 @@
               <w:dataBinding w:prefixMappings="xmlns:ns0='http://purl.org/dc/elements/1.1/' xmlns:ns1='http://schemas.openxmlformats.org/package/2006/metadata/core-properties' " w:xpath="/ns1:coreProperties[1]/ns0:title[1]" w:storeItemID="{6C3C8BC8-F283-45AE-878A-BAB7291924A1}"/>
               <w:text/>
             </w:sdtPr>
+            <w:sdtEndPr/>
             <w:sdtContent>
               <w:r>
                 <w:rPr>
@@ -1382,6 +1340,7 @@
               <w:dataBinding w:prefixMappings="xmlns:ns0='http://schemas.microsoft.com/office/2006/metadata/properties' xmlns:ns1='http://www.w3.org/2001/XMLSchema-instance' xmlns:ns2='http://schemas.microsoft.com/office/infopath/2007/PartnerControls' xmlns:ns3='d0a21689-7831-42d6-ab5e-18dcb17ec99f' xmlns:ns4='http://www.w3.org/2000/xmlns/' " w:xpath="/ns0:properties[1]/documentManagement[1]/ns3:DocumentID[1]" w:storeItemID="{63BF2DBE-B3C6-4D34-B356-7884C7C6B40A}"/>
               <w:text/>
             </w:sdtPr>
+            <w:sdtEndPr/>
             <w:sdtContent>
               <w:r>
                 <w:rPr>
@@ -1443,6 +1402,7 @@
               <w:dataBinding w:prefixMappings="xmlns:ns0='http://schemas.microsoft.com/office/2006/metadata/properties' xmlns:ns1='http://www.w3.org/2001/XMLSchema-instance' xmlns:ns2='http://schemas.microsoft.com/office/infopath/2007/PartnerControls' xmlns:ns3='d0a21689-7831-42d6-ab5e-18dcb17ec99f' " w:xpath="/ns0:properties[1]/documentManagement[1]/ns3:Revision[1]" w:storeItemID="{63BF2DBE-B3C6-4D34-B356-7884C7C6B40A}"/>
               <w:text/>
             </w:sdtPr>
+            <w:sdtEndPr/>
             <w:sdtContent>
               <w:r>
                 <w:rPr>
@@ -1739,6 +1699,7 @@
             <w:listItem w:value="[Release Status]"/>
           </w:dropDownList>
         </w:sdtPr>
+        <w:sdtEndPr/>
         <w:sdtContent>
           <w:tc>
             <w:tcPr>
@@ -1805,6 +1766,7 @@
               <w:listItem w:value="[Confidentiality]"/>
             </w:dropDownList>
           </w:sdtPr>
+          <w:sdtEndPr/>
           <w:sdtContent>
             <w:p>
               <w:pPr>
@@ -1930,6 +1892,7 @@
               <w:dataBinding w:prefixMappings="xmlns:ns0='http://purl.org/dc/elements/1.1/' xmlns:ns1='http://schemas.openxmlformats.org/package/2006/metadata/core-properties' " w:xpath="/ns1:coreProperties[1]/ns0:title[1]" w:storeItemID="{6C3C8BC8-F283-45AE-878A-BAB7291924A1}"/>
               <w:text/>
             </w:sdtPr>
+            <w:sdtEndPr/>
             <w:sdtContent>
               <w:r>
                 <w:rPr>
@@ -1986,6 +1949,7 @@
               <w:dataBinding w:prefixMappings="xmlns:ns0='http://schemas.microsoft.com/office/2006/metadata/properties' xmlns:ns1='http://www.w3.org/2001/XMLSchema-instance' xmlns:ns2='http://schemas.microsoft.com/office/infopath/2007/PartnerControls' xmlns:ns3='d0a21689-7831-42d6-ab5e-18dcb17ec99f' xmlns:ns4='http://www.w3.org/2000/xmlns/' " w:xpath="/ns0:properties[1]/documentManagement[1]/ns3:DocumentID[1]" w:storeItemID="{63BF2DBE-B3C6-4D34-B356-7884C7C6B40A}"/>
               <w:text/>
             </w:sdtPr>
+            <w:sdtEndPr/>
             <w:sdtContent>
               <w:r>
                 <w:rPr>
@@ -2048,6 +2012,7 @@
               <w:dataBinding w:prefixMappings="xmlns:ns0='http://schemas.microsoft.com/office/2006/metadata/properties' xmlns:ns1='http://www.w3.org/2001/XMLSchema-instance' xmlns:ns2='http://schemas.microsoft.com/office/infopath/2007/PartnerControls' xmlns:ns3='d0a21689-7831-42d6-ab5e-18dcb17ec99f' " w:xpath="/ns0:properties[1]/documentManagement[1]/ns3:Revision[1]" w:storeItemID="{63BF2DBE-B3C6-4D34-B356-7884C7C6B40A}"/>
               <w:text/>
             </w:sdtPr>
+            <w:sdtEndPr/>
             <w:sdtContent>
               <w:r>
                 <w:rPr>
@@ -2295,6 +2260,7 @@
                 <w:calendar w:val="gregorian"/>
               </w:date>
             </w:sdtPr>
+            <w:sdtEndPr/>
             <w:sdtContent>
               <w:r>
                 <w:rPr>
@@ -2356,6 +2322,7 @@
           <w:dataBinding w:prefixMappings="xmlns:ns0='http://schemas.microsoft.com/office/2006/metadata/properties' xmlns:ns1='http://www.w3.org/2001/XMLSchema-instance' xmlns:ns2='http://schemas.microsoft.com/office/infopath/2007/PartnerControls' xmlns:ns3='d0a21689-7831-42d6-ab5e-18dcb17ec99f' " w:xpath="/ns0:properties[1]/documentManagement[1]/ns3:AssignedMaintainer[1]/ns3:UserInfo[1]/ns3:DisplayName[1]" w:storeItemID="{63BF2DBE-B3C6-4D34-B356-7884C7C6B40A}"/>
           <w:text/>
         </w:sdtPr>
+        <w:sdtEndPr/>
         <w:sdtContent>
           <w:tc>
             <w:tcPr>
@@ -5079,6 +5046,8 @@
     <w:rsid w:val="00904ED8"/>
     <w:rsid w:val="00940587"/>
     <w:rsid w:val="00965FBE"/>
+    <w:rsid w:val="009766A9"/>
+    <w:rsid w:val="009F4B81"/>
     <w:rsid w:val="00A46843"/>
     <w:rsid w:val="00A571A3"/>
     <w:rsid w:val="00B869E8"/>
@@ -5928,6 +5897,28 @@
 </file>
 
 <file path=customXml/item2.xml><?xml version="1.0" encoding="utf-8"?>
+<p:properties xmlns:p="http://schemas.microsoft.com/office/2006/metadata/properties" xmlns:xsi="http://www.w3.org/2001/XMLSchema-instance" xmlns:pc="http://schemas.microsoft.com/office/infopath/2007/PartnerControls">
+  <documentManagement>
+    <Revision xmlns="d0a21689-7831-42d6-ab5e-18dcb17ec99f">A</Revision>
+    <DocumentID xmlns="d0a21689-7831-42d6-ab5e-18dcb17ec99f">DOC-00011</DocumentID>
+    <Confidentiality xmlns="d0a21689-7831-42d6-ab5e-18dcb17ec99f">Internal</Confidentiality>
+    <Status xmlns="d0a21689-7831-42d6-ab5e-18dcb17ec99f">Preliminary</Status>
+    <AssignedMaintainer xmlns="d0a21689-7831-42d6-ab5e-18dcb17ec99f">
+      <UserInfo>
+        <DisplayName>Slava Thereshin</DisplayName>
+        <AccountId>11</AccountId>
+        <AccountType/>
+      </UserInfo>
+    </AssignedMaintainer>
+  </documentManagement>
+</p:properties>
+</file>
+
+<file path=customXml/item3.xml><?xml version="1.0" encoding="utf-8"?>
+<b:Sources xmlns:b="http://schemas.openxmlformats.org/officeDocument/2006/bibliography" xmlns="http://schemas.openxmlformats.org/officeDocument/2006/bibliography" SelectedStyle="\APASixthEditionOfficeOnline.xsl" StyleName="APA" Version="6"/>
+</file>
+
+<file path=customXml/item4.xml><?xml version="1.0" encoding="utf-8"?>
 <ct:contentTypeSchema xmlns:ct="http://schemas.microsoft.com/office/2006/metadata/contentType" xmlns:ma="http://schemas.microsoft.com/office/2006/metadata/properties/metaAttributes" ct:_="" ma:_="" ma:contentTypeName="Document" ma:contentTypeID="0x01010097E3F458759F934FBF98477861B30E17" ma:contentTypeVersion="9" ma:contentTypeDescription="Create a new document." ma:contentTypeScope="" ma:versionID="20bd56559113204125d9b5a00727f95e">
   <xsd:schema xmlns:xsd="http://www.w3.org/2001/XMLSchema" xmlns:xs="http://www.w3.org/2001/XMLSchema" xmlns:p="http://schemas.microsoft.com/office/2006/metadata/properties" xmlns:ns2="d0a21689-7831-42d6-ab5e-18dcb17ec99f" targetNamespace="http://schemas.microsoft.com/office/2006/metadata/properties" ma:root="true" ma:fieldsID="1a465cdb4615ac0d137ed4d3b9785716" ns2:_="">
     <xsd:import namespace="d0a21689-7831-42d6-ab5e-18dcb17ec99f"/>
@@ -6123,28 +6114,6 @@
 </ct:contentTypeSchema>
 </file>
 
-<file path=customXml/item3.xml><?xml version="1.0" encoding="utf-8"?>
-<b:Sources xmlns:b="http://schemas.openxmlformats.org/officeDocument/2006/bibliography" xmlns="http://schemas.openxmlformats.org/officeDocument/2006/bibliography" SelectedStyle="\APASixthEditionOfficeOnline.xsl" StyleName="APA" Version="6"/>
-</file>
-
-<file path=customXml/item4.xml><?xml version="1.0" encoding="utf-8"?>
-<p:properties xmlns:p="http://schemas.microsoft.com/office/2006/metadata/properties" xmlns:xsi="http://www.w3.org/2001/XMLSchema-instance" xmlns:pc="http://schemas.microsoft.com/office/infopath/2007/PartnerControls">
-  <documentManagement>
-    <Revision xmlns="d0a21689-7831-42d6-ab5e-18dcb17ec99f">A</Revision>
-    <DocumentID xmlns="d0a21689-7831-42d6-ab5e-18dcb17ec99f">DOC-00011</DocumentID>
-    <Confidentiality xmlns="d0a21689-7831-42d6-ab5e-18dcb17ec99f">Internal</Confidentiality>
-    <Status xmlns="d0a21689-7831-42d6-ab5e-18dcb17ec99f">Preliminary</Status>
-    <AssignedMaintainer xmlns="d0a21689-7831-42d6-ab5e-18dcb17ec99f">
-      <UserInfo>
-        <DisplayName>Slava Thereshin</DisplayName>
-        <AccountId>11</AccountId>
-        <AccountType/>
-      </UserInfo>
-    </AssignedMaintainer>
-  </documentManagement>
-</p:properties>
-</file>
-
 <file path=customXml/item5.xml><?xml version="1.0" encoding="utf-8"?>
 <?mso-contentType ?>
 <FormTemplates xmlns="http://schemas.microsoft.com/sharepoint/v3/contenttype/forms">
@@ -6163,6 +6132,24 @@
 </file>
 
 <file path=customXml/itemProps2.xml><?xml version="1.0" encoding="utf-8"?>
+<ds:datastoreItem xmlns:ds="http://schemas.openxmlformats.org/officeDocument/2006/customXml" ds:itemID="{63BF2DBE-B3C6-4D34-B356-7884C7C6B40A}">
+  <ds:schemaRefs>
+    <ds:schemaRef ds:uri="http://schemas.microsoft.com/office/2006/metadata/properties"/>
+    <ds:schemaRef ds:uri="http://schemas.microsoft.com/office/infopath/2007/PartnerControls"/>
+    <ds:schemaRef ds:uri="d0a21689-7831-42d6-ab5e-18dcb17ec99f"/>
+  </ds:schemaRefs>
+</ds:datastoreItem>
+</file>
+
+<file path=customXml/itemProps3.xml><?xml version="1.0" encoding="utf-8"?>
+<ds:datastoreItem xmlns:ds="http://schemas.openxmlformats.org/officeDocument/2006/customXml" ds:itemID="{EC88D164-0482-43B5-990B-67595C64CB30}">
+  <ds:schemaRefs>
+    <ds:schemaRef ds:uri="http://schemas.openxmlformats.org/officeDocument/2006/bibliography"/>
+  </ds:schemaRefs>
+</ds:datastoreItem>
+</file>
+
+<file path=customXml/itemProps4.xml><?xml version="1.0" encoding="utf-8"?>
 <ds:datastoreItem xmlns:ds="http://schemas.openxmlformats.org/officeDocument/2006/customXml" ds:itemID="{925D3E24-250F-4782-B012-5167B1716896}">
   <ds:schemaRefs>
     <ds:schemaRef ds:uri="http://schemas.microsoft.com/office/2006/metadata/contentType"/>
@@ -6180,24 +6167,6 @@
 </ds:datastoreItem>
 </file>
 
-<file path=customXml/itemProps3.xml><?xml version="1.0" encoding="utf-8"?>
-<ds:datastoreItem xmlns:ds="http://schemas.openxmlformats.org/officeDocument/2006/customXml" ds:itemID="{EC88D164-0482-43B5-990B-67595C64CB30}">
-  <ds:schemaRefs>
-    <ds:schemaRef ds:uri="http://schemas.openxmlformats.org/officeDocument/2006/bibliography"/>
-  </ds:schemaRefs>
-</ds:datastoreItem>
-</file>
-
-<file path=customXml/itemProps4.xml><?xml version="1.0" encoding="utf-8"?>
-<ds:datastoreItem xmlns:ds="http://schemas.openxmlformats.org/officeDocument/2006/customXml" ds:itemID="{63BF2DBE-B3C6-4D34-B356-7884C7C6B40A}">
-  <ds:schemaRefs>
-    <ds:schemaRef ds:uri="http://schemas.microsoft.com/office/2006/metadata/properties"/>
-    <ds:schemaRef ds:uri="http://schemas.microsoft.com/office/infopath/2007/PartnerControls"/>
-    <ds:schemaRef ds:uri="d0a21689-7831-42d6-ab5e-18dcb17ec99f"/>
-  </ds:schemaRefs>
-</ds:datastoreItem>
-</file>
-
 <file path=customXml/itemProps5.xml><?xml version="1.0" encoding="utf-8"?>
 <ds:datastoreItem xmlns:ds="http://schemas.openxmlformats.org/officeDocument/2006/customXml" ds:itemID="{028A07E9-5B73-4D12-85E2-5AA85E236A28}">
   <ds:schemaRefs>

</xml_diff>